<commit_message>
v3.15.0 : onglets Setup réordonnés, exports en lecture pour le chef de groupe, lien de connexion dans l'e-mail
Co-Authored-By: Claude Sonnet 5.5 <noreply@anthropic.com>
Claude-Session: https://claude.ai/code/session_01X2N9yuBhmf2MHQAUEM1VoV
</commit_message>
<xml_diff>
--- a/Kit-Sijil/Sijil-Manuel.docx
+++ b/Kit-Sijil/Sijil-Manuel.docx
@@ -78,7 +78,7 @@
         <w:rPr>
           <w:color w:val="6B7785"/>
         </w:rPr>
-        <w:t>Version 3.14 · Octobre 2026</w:t>
+        <w:t>Version 3.15 · Octobre 2026</w:t>
       </w:r>
     </w:p>
     <w:p/>
@@ -2950,7 +2950,7 @@
     </w:p>
     <w:p>
       <w:r>
-        <w:t>Les demandes arrivent dans « Demandes », regroupées par thème, avec une pastille et un e-mail. Cochez celles à transmettre, ajoutez une note, puis « Envoyer à la direction » : une seule demande groupée part par e-mail. Quand la direction répond, enregistrez la réponse : elle s'applique à toutes les demandes de l'envoi. Une demande envoyée à la direction est marquée « Traitée : demande transmise à la direction (nom du prestataire) ». Avant l'envoi, le bouton « Modifier » corrige une demande (type, dates, message) à la place de l'agent.</w:t>
+        <w:t>Dans « Exports », le chef de groupe extrait en Excel ou PDF la fiche de pointage, l'attachement du mois et la facture déjà établie (consultation seulement : la validation et la facturation restent à l'administrateur). Les demandes arrivent dans « Demandes », regroupées par thème, avec une pastille et un e-mail. Cochez celles à transmettre, ajoutez une note, puis « Envoyer à la direction » : une seule demande groupée part par e-mail. Quand la direction répond, enregistrez la réponse : elle s'applique à toutes les demandes de l'envoi. Une demande envoyée à la direction est marquée « Traitée : demande transmise à la direction (nom du prestataire) ». Avant l'envoi, le bouton « Modifier » corrige une demande (type, dates, message) à la place de l'agent.</w:t>
       </w:r>
     </w:p>
     <w:p>

</xml_diff>

<commit_message>
v3.16.0 : privilège exports par chef de groupe, 3 e-mails client et direction
Co-Authored-By: Claude Sonnet 5.5 <noreply@anthropic.com>
Claude-Session: https://claude.ai/code/session_01X2N9yuBhmf2MHQAUEM1VoV
</commit_message>
<xml_diff>
--- a/Kit-Sijil/Sijil-Manuel.docx
+++ b/Kit-Sijil/Sijil-Manuel.docx
@@ -78,7 +78,7 @@
         <w:rPr>
           <w:color w:val="6B7785"/>
         </w:rPr>
-        <w:t>Version 3.15 · Octobre 2026</w:t>
+        <w:t>Version 3.16 · Octobre 2026</w:t>
       </w:r>
     </w:p>
     <w:p/>
@@ -2950,7 +2950,7 @@
     </w:p>
     <w:p>
       <w:r>
-        <w:t>Dans « Exports », le chef de groupe extrait en Excel ou PDF la fiche de pointage, l'attachement du mois et la facture déjà établie (consultation seulement : la validation et la facturation restent à l'administrateur). Les demandes arrivent dans « Demandes », regroupées par thème, avec une pastille et un e-mail. Cochez celles à transmettre, ajoutez une note, puis « Envoyer à la direction » : une seule demande groupée part par e-mail. Quand la direction répond, enregistrez la réponse : elle s'applique à toutes les demandes de l'envoi. Une demande envoyée à la direction est marquée « Traitée : demande transmise à la direction (nom du prestataire) ». Avant l'envoi, le bouton « Modifier » corrige une demande (type, dates, message) à la place de l'agent.</w:t>
+        <w:t>Dans « Exports », le chef de groupe extrait en Excel ou PDF la fiche de pointage ; l'attachement du mois et la facture déjà établie ne lui sont ouverts que si l'administrateur lui accorde ce privilège dans sa fiche (consultation seulement : la validation et la facturation restent à l'administrateur). L'administrateur peut aussi lui donner ou non l'accès au Setup. Les demandes arrivent dans « Demandes », regroupées par thème, avec une pastille et un e-mail. Cochez celles à transmettre, ajoutez une note, puis « Envoyer à la direction » : une seule demande groupée part par e-mail. Quand la direction répond, enregistrez la réponse : elle s'applique à toutes les demandes de l'envoi. Une demande envoyée à la direction est marquée « Traitée : demande transmise à la direction (nom du prestataire) ». Avant l'envoi, le bouton « Modifier » corrige une demande (type, dates, message) à la place de l'agent.</w:t>
       </w:r>
     </w:p>
     <w:p>
@@ -3488,7 +3488,7 @@
     </w:p>
     <w:p>
       <w:r>
-        <w:t>Le contact client reçoit un compte de consultation limité à son contrat. Il suit le pointage (mois, 3 mois, 6 mois, 1 an), le contrat, les attachements et les factures validés. Il ne peut rien modifier.</w:t>
+        <w:t>Le contact client reçoit un compte de consultation limité à son contrat ; jusqu'à 3 adresses e-mail peuvent être saisies dans le contrat (Setup → Contrat), chacune avec le même compte de consultation. L'e-mail de la direction du prestataire accepte aussi 3 adresses. Il suit le pointage (mois, 3 mois, 6 mois, 1 an), le contrat, les attachements et les factures validés. Il ne peut rien modifier.</w:t>
       </w:r>
     </w:p>
     <w:p>

</xml_diff>

<commit_message>
v3.17.0 : onglet Connexions (en ligne, dernière connexion) pour l'administrateur
Co-Authored-By: Claude Sonnet 5.5 <noreply@anthropic.com>
Claude-Session: https://claude.ai/code/session_01X2N9yuBhmf2MHQAUEM1VoV
</commit_message>
<xml_diff>
--- a/Kit-Sijil/Sijil-Manuel.docx
+++ b/Kit-Sijil/Sijil-Manuel.docx
@@ -78,7 +78,7 @@
         <w:rPr>
           <w:color w:val="6B7785"/>
         </w:rPr>
-        <w:t>Version 3.16 · Octobre 2026</w:t>
+        <w:t>Version 3.17 · Octobre 2026</w:t>
       </w:r>
     </w:p>
     <w:p/>
@@ -387,6 +387,18 @@
           <w:sz w:val="20"/>
         </w:rPr>
         <w:t>Maintenance : export, import et sauvegarde</w:t>
+      </w:r>
+    </w:p>
+    <w:p>
+      <w:pPr>
+        <w:spacing w:after="20"/>
+        <w:ind w:left="454"/>
+      </w:pPr>
+      <w:r>
+        <w:rPr>
+          <w:sz w:val="20"/>
+        </w:rPr>
+        <w:t>Qui est connecté ?</w:t>
       </w:r>
     </w:p>
     <w:p>
@@ -3210,7 +3222,7 @@
           <w:color w:val="6B7785"/>
           <w:sz w:val="18"/>
         </w:rPr>
-        <w:t>La modification du contrat : début, durée et contact client.</w:t>
+        <w:t>La modification du contrat : début et durée.</w:t>
       </w:r>
     </w:p>
     <w:p>
@@ -3406,6 +3418,19 @@
         <w:pStyle w:val="Heading2"/>
       </w:pPr>
       <w:r>
+        <w:t>Qui est connecté ?</w:t>
+      </w:r>
+    </w:p>
+    <w:p>
+      <w:r>
+        <w:t>L'onglet « Connexions » (administrateur) montre qui est en ligne maintenant, la date de la dernière connexion de chaque utilisateur, le nombre de connexions et ceux qui ne se sont jamais connectés. La liste se rafraîchit toute seule.</w:t>
+      </w:r>
+    </w:p>
+    <w:p>
+      <w:pPr>
+        <w:pStyle w:val="Heading2"/>
+      </w:pPr>
+      <w:r>
         <w:t>L'attachement et la facture</w:t>
       </w:r>
     </w:p>
@@ -3488,7 +3513,7 @@
     </w:p>
     <w:p>
       <w:r>
-        <w:t>Le contact client reçoit un compte de consultation limité à son contrat ; jusqu'à 3 adresses e-mail peuvent être saisies dans le contrat (Setup → Contrat), chacune avec le même compte de consultation. L'e-mail de la direction du prestataire accepte aussi 3 adresses. Il suit le pointage (mois, 3 mois, 6 mois, 1 an), le contrat, les attachements et les factures validés. Il ne peut rien modifier.</w:t>
+        <w:t>Le contact client reçoit un compte de consultation limité à son contrat ; jusqu'à 4 adresses e-mail peuvent être saisies dans Setup → Client, chacune avec le même compte de consultation. L'e-mail de la direction du prestataire accepte aussi 4 adresses. Il suit le pointage (mois, 3 mois, 6 mois, 1 an), le contrat, les attachements et les factures validés. Il ne peut rien modifier.</w:t>
       </w:r>
     </w:p>
     <w:p>

</xml_diff>

<commit_message>
v3.18.0 : « chef de groupe » devient « responsable d'équipe » partout ; nouveautés traduites
Co-Authored-By: Claude Sonnet 5.5 <noreply@anthropic.com>
Claude-Session: https://claude.ai/code/session_01X2N9yuBhmf2MHQAUEM1VoV
</commit_message>
<xml_diff>
--- a/Kit-Sijil/Sijil-Manuel.docx
+++ b/Kit-Sijil/Sijil-Manuel.docx
@@ -78,7 +78,7 @@
         <w:rPr>
           <w:color w:val="6B7785"/>
         </w:rPr>
-        <w:t>Version 3.17 · Octobre 2026</w:t>
+        <w:t>Version 3.18 · Octobre 2026</w:t>
       </w:r>
     </w:p>
     <w:p/>
@@ -268,7 +268,7 @@
           <w:color w:val="0E4377"/>
           <w:sz w:val="23"/>
         </w:rPr>
-        <w:t>4. Guide du chef de groupe</w:t>
+        <w:t>4. Guide du responsable d’équipe</w:t>
       </w:r>
     </w:p>
     <w:p>
@@ -832,7 +832,7 @@
                 <w:b/>
                 <w:sz w:val="20"/>
               </w:rPr>
-              <w:t>Chef de groupe</w:t>
+              <w:t>Responsable d’équipe</w:t>
             </w:r>
           </w:p>
         </w:tc>
@@ -874,7 +874,7 @@
               <w:rPr>
                 <w:sz w:val="20"/>
               </w:rPr>
-              <w:t>Fait tout ce que fait le chef de groupe, et configure l'entreprise : contrats, attachements, factures, sauvegardes.</w:t>
+              <w:t>Fait tout ce que fait le responsable d’équipe, et configure l'entreprise : contrats, attachements, factures, sauvegardes.</w:t>
             </w:r>
           </w:p>
         </w:tc>
@@ -1211,7 +1211,7 @@
               <w:rPr>
                 <w:sz w:val="19"/>
               </w:rPr>
-              <w:t>Titre de congé, attestation, ATS, fiche d'émoluments, prolongations : le chef de groupe les regroupe par thème et envoie une seule demande à la direction.</w:t>
+              <w:t>Titre de congé, attestation, ATS, fiche d'émoluments, prolongations : le responsable d’équipe les regroupe par thème et envoie une seule demande à la direction.</w:t>
             </w:r>
           </w:p>
         </w:tc>
@@ -2305,7 +2305,7 @@
     </w:p>
     <w:p>
       <w:r>
-        <w:t>Choisissez le type de demande (titre de congé, attestation de travail, ATS, fiche d'émoluments, prolongation de congé ou de séjour), les dates si besoin, ajoutez un message, puis « Envoyer ma demande ». Votre chef de groupe est prévenu par e-mail. Pour un titre de congé, la date de reprise est calculée pour vous. Tant que la demande est « En attente », le bouton « Modifier » permet de corriger un oubli ou une mauvaise date.</w:t>
+        <w:t>Choisissez le type de demande (titre de congé, attestation de travail, ATS, fiche d'émoluments, prolongation de congé ou de séjour), les dates si besoin, ajoutez un message, puis « Envoyer ma demande ». Votre responsable d’équipe est prévenu par e-mail. Pour un titre de congé, la date de reprise est calculée pour vous. Tant que la demande est « En attente », le bouton « Modifier » permet de corriger un oubli ou une mauvaise date.</w:t>
       </w:r>
     </w:p>
     <w:p>
@@ -2493,7 +2493,7 @@
         <w:pStyle w:val="Heading1"/>
       </w:pPr>
       <w:r>
-        <w:t>4. Guide du chef de groupe</w:t>
+        <w:t>4. Guide du responsable d’équipe</w:t>
       </w:r>
     </w:p>
     <w:p>
@@ -2640,7 +2640,7 @@
     </w:p>
     <w:p>
       <w:r>
-        <w:t>« Pointage global » (ou « Mon groupe » pour un chef de groupe) montre tous les agents. Mois est la vue détaillée ; 3 mois, 6 mois et 1 an étalent la grille à partir du mois choisi, avec le jour d'aujourd'hui marqué et la liste des jours fériés sous la grille. À droite : jours T, CR, ABS de la période et solde cumulé.</w:t>
+        <w:t>« Pointage global » (ou « Mon groupe » pour un responsable d’équipe) montre tous les agents. Mois est la vue détaillée ; 3 mois, 6 mois et 1 an étalent la grille à partir du mois choisi, avec le jour d'aujourd'hui marqué et la liste des jours fériés sous la grille. À droite : jours T, CR, ABS de la période et solde cumulé.</w:t>
       </w:r>
     </w:p>
     <w:p>
@@ -2815,7 +2815,7 @@
     </w:p>
     <w:p>
       <w:r>
-        <w:t>Dans « Agents » : créez un agent avec son nom, son e-mail (son identifiant), son rôle, son contrat, sa fonction, son affectation, sa rotation et son chef de groupe. Laissez le mot de passe vide, il est généré, et cochez « Envoyer ses accès par e-mail ». Le bouton « Envoyer l'accès » de la liste renvoie un nouveau mot de passe provisoire à tout moment. Pour changer plusieurs agents d'un coup, cochez leurs lignes : une barre apparaît en bas de l'écran.</w:t>
+        <w:t>Dans « Agents » : créez un agent avec son nom, son e-mail (son identifiant), son rôle, son contrat, sa fonction, son affectation, sa rotation et son responsable d’équipe. Laissez le mot de passe vide, il est généré, et cochez « Envoyer ses accès par e-mail ». Le bouton « Envoyer l'accès » de la liste renvoie un nouveau mot de passe provisoire à tout moment. Pour changer plusieurs agents d'un coup, cochez leurs lignes : une barre apparaît en bas de l'écran.</w:t>
       </w:r>
     </w:p>
     <w:p>
@@ -2945,7 +2945,7 @@
               <w:rPr>
                 <w:sz w:val="20"/>
               </w:rPr>
-              <w:t>ℹ  Pour avoir un chef de groupe, donnez le rôle « Chef de groupe » à un agent, puis choisissez-le dans le champ « Chef de groupe » des autres agents.</w:t>
+              <w:t>ℹ  Pour avoir un responsable d’équipe, donnez le rôle « Responsable d’équipe » à un agent, puis choisissez-le dans le champ « Responsable d’équipe » des autres agents.</w:t>
             </w:r>
           </w:p>
         </w:tc>
@@ -2962,7 +2962,7 @@
     </w:p>
     <w:p>
       <w:r>
-        <w:t>Dans « Exports », le chef de groupe extrait en Excel ou PDF la fiche de pointage ; l'attachement du mois et la facture déjà établie ne lui sont ouverts que si l'administrateur lui accorde ce privilège dans sa fiche (consultation seulement : la validation et la facturation restent à l'administrateur). L'administrateur peut aussi lui donner ou non l'accès au Setup. Les demandes arrivent dans « Demandes », regroupées par thème, avec une pastille et un e-mail. Cochez celles à transmettre, ajoutez une note, puis « Envoyer à la direction » : une seule demande groupée part par e-mail. Quand la direction répond, enregistrez la réponse : elle s'applique à toutes les demandes de l'envoi. Une demande envoyée à la direction est marquée « Traitée : demande transmise à la direction (nom du prestataire) ». Avant l'envoi, le bouton « Modifier » corrige une demande (type, dates, message) à la place de l'agent.</w:t>
+        <w:t>Dans « Exports », le responsable d’équipe extrait en Excel ou PDF la fiche de pointage ; l'attachement du mois et la facture déjà établie ne lui sont ouverts que si l'administrateur lui accorde ce privilège dans sa fiche (consultation seulement : la validation et la facturation restent à l'administrateur). L'administrateur peut aussi lui donner ou non l'accès au Setup. Les demandes arrivent dans « Demandes », regroupées par thème, avec une pastille et un e-mail. Cochez celles à transmettre, ajoutez une note, puis « Envoyer à la direction » : une seule demande groupée part par e-mail. Quand la direction répond, enregistrez la réponse : elle s'applique à toutes les demandes de l'envoi. Une demande envoyée à la direction est marquée « Traitée : demande transmise à la direction (nom du prestataire) ». Avant l'envoi, le bouton « Modifier » corrige une demande (type, dates, message) à la place de l'agent.</w:t>
       </w:r>
     </w:p>
     <w:p>
@@ -3101,7 +3101,7 @@
     </w:p>
     <w:p>
       <w:r>
-        <w:t>L'administrateur dispose de tout ce que voit le chef de groupe, plus le Setup, les contrats, les attachements et les factures.</w:t>
+        <w:t>L'administrateur dispose de tout ce que voit le responsable d’équipe, plus le Setup, les contrats, les attachements et les factures.</w:t>
       </w:r>
     </w:p>
     <w:p>
@@ -3572,7 +3572,7 @@
     </w:p>
     <w:p>
       <w:r>
-        <w:t>Pour faire une remarque, le client clique sur un jour du pointage et l'écrit. Elle est signalée par un repère rouge dans la grille et envoyée par e-mail au chef de groupe.</w:t>
+        <w:t>Pour faire une remarque, le client clique sur un jour du pointage et l'écrit. Elle est signalée par un repère rouge dans la grille et envoyée par e-mail au responsable d’équipe.</w:t>
       </w:r>
     </w:p>
     <w:p>
@@ -3918,7 +3918,7 @@
         <w:pStyle w:val="ListBullet"/>
       </w:pPr>
       <w:r>
-        <w:t>Droits par profil : l'agent ne voit que lui, le chef de groupe que son équipe, le client que son contrat et les attachements validés.</w:t>
+        <w:t>Droits par profil : l'agent ne voit que lui, le responsable d’équipe que son équipe, le client que son contrat et les attachements validés.</w:t>
       </w:r>
     </w:p>
     <w:p>
@@ -4059,7 +4059,7 @@
               <w:rPr>
                 <w:sz w:val="20"/>
               </w:rPr>
-              <w:t>Sur la page de connexion, cliquez sur « Mot de passe oublié ? » et saisissez votre e-mail : un code à 6 chiffres vous est envoyé (valable 30 minutes). Saisissez-le avec votre nouveau mot de passe. Sinon, votre chef de groupe ou votre administrateur peut vous renvoyer un accès.</w:t>
+              <w:t>Sur la page de connexion, cliquez sur « Mot de passe oublié ? » et saisissez votre e-mail : un code à 6 chiffres vous est envoyé (valable 30 minutes). Saisissez-le avec votre nouveau mot de passe. Sinon, votre responsable d’équipe ou votre administrateur peut vous renvoyer un accès.</w:t>
             </w:r>
           </w:p>
         </w:tc>

</xml_diff>

<commit_message>
v3.19.0 : connexions de toutes les entreprises (éditeur) + journal, remarques des agents sur leur pointage
Co-Authored-By: Claude Sonnet 5.5 <noreply@anthropic.com>
Claude-Session: https://claude.ai/code/session_01X2N9yuBhmf2MHQAUEM1VoV
</commit_message>
<xml_diff>
--- a/Kit-Sijil/Sijil-Manuel.docx
+++ b/Kit-Sijil/Sijil-Manuel.docx
@@ -78,7 +78,7 @@
         <w:rPr>
           <w:color w:val="6B7785"/>
         </w:rPr>
-        <w:t>Version 3.18 · Octobre 2026</w:t>
+        <w:t>Version 3.19 · Octobre 2026</w:t>
       </w:r>
     </w:p>
     <w:p/>
@@ -247,6 +247,18 @@
           <w:sz w:val="20"/>
         </w:rPr>
         <w:t>Mes demandes</w:t>
+      </w:r>
+    </w:p>
+    <w:p>
+      <w:pPr>
+        <w:spacing w:after="20"/>
+        <w:ind w:left="454"/>
+      </w:pPr>
+      <w:r>
+        <w:rPr>
+          <w:sz w:val="20"/>
+        </w:rPr>
+        <w:t>Laisser une remarque sur mon pointage</w:t>
       </w:r>
     </w:p>
     <w:p>
@@ -2367,6 +2379,19 @@
         <w:pStyle w:val="Heading2"/>
       </w:pPr>
       <w:r>
+        <w:t>Laisser une remarque sur mon pointage</w:t>
+      </w:r>
+    </w:p>
+    <w:p>
+      <w:r>
+        <w:t>Dans « Mon pointage », cliquez sur un jour et écrivez votre remarque (par exemple « j'étais présent ce jour-là »). Votre responsable d'équipe est prévenu par e-mail, la consulte et peut vous répondre. Seuls vous et votre responsable la voient.</w:t>
+      </w:r>
+    </w:p>
+    <w:p>
+      <w:pPr>
+        <w:pStyle w:val="Heading2"/>
+      </w:pPr>
+      <w:r>
         <w:t>Mes documents</w:t>
       </w:r>
     </w:p>
@@ -3423,7 +3448,7 @@
     </w:p>
     <w:p>
       <w:r>
-        <w:t>L'onglet « Connexions » (administrateur) montre qui est en ligne maintenant, la date de la dernière connexion de chaque utilisateur, le nombre de connexions et ceux qui ne se sont jamais connectés. La liste se rafraîchit toute seule.</w:t>
+        <w:t>L'onglet « Connexions » (administrateur) montre qui est en ligne maintenant, la date de la dernière connexion de chaque utilisateur, le nombre de connexions et ceux qui ne se sont jamais connectés. Pour l'éditeur du produit, l'onglet rassemble toutes les entreprises clientes : un tableau par entreprise, le journal des dernières connexions et la liste de tous les utilisateurs. La liste se rafraîchit toute seule.</w:t>
       </w:r>
     </w:p>
     <w:p>

</xml_diff>

<commit_message>
v3.20.0 : sélecteur d'entreprise (accès support complet), À propos retiré du menu éditeur, accès journalisés
Co-Authored-By: Claude Sonnet 5.5 <noreply@anthropic.com>
Claude-Session: https://claude.ai/code/session_01X2N9yuBhmf2MHQAUEM1VoV
</commit_message>
<xml_diff>
--- a/Kit-Sijil/Sijil-Manuel.docx
+++ b/Kit-Sijil/Sijil-Manuel.docx
@@ -78,7 +78,7 @@
         <w:rPr>
           <w:color w:val="6B7785"/>
         </w:rPr>
-        <w:t>Version 3.19 · Octobre 2026</w:t>
+        <w:t>Version 3.20 · Octobre 2026</w:t>
       </w:r>
     </w:p>
     <w:p/>
@@ -411,6 +411,18 @@
           <w:sz w:val="20"/>
         </w:rPr>
         <w:t>Qui est connecté ?</w:t>
+      </w:r>
+    </w:p>
+    <w:p>
+      <w:pPr>
+        <w:spacing w:after="20"/>
+        <w:ind w:left="454"/>
+      </w:pPr>
+      <w:r>
+        <w:rPr>
+          <w:sz w:val="20"/>
+        </w:rPr>
+        <w:t>Éditeur : changer d'entreprise</w:t>
       </w:r>
     </w:p>
     <w:p>
@@ -3456,6 +3468,19 @@
         <w:pStyle w:val="Heading2"/>
       </w:pPr>
       <w:r>
+        <w:t>Éditeur : changer d'entreprise</w:t>
+      </w:r>
+    </w:p>
+    <w:p>
+      <w:r>
+        <w:t>Le compte éditeur a, dans l'en-tête, un sélecteur d'entreprise. Choisir un client ouvre son espace avec tous les droits de son administrateur (onglets, pointages, mots de passe, réglages). Un bandeau rappelle le mode support et « Retour à l'administration » ramène à la console. Chaque accès est noté dans le journal des connexions.</w:t>
+      </w:r>
+    </w:p>
+    <w:p>
+      <w:pPr>
+        <w:pStyle w:val="Heading2"/>
+      </w:pPr>
+      <w:r>
         <w:t>L'attachement et la facture</w:t>
       </w:r>
     </w:p>

</xml_diff>

<commit_message>
v3.21.0 : dépôt de documents en vrac (reconnaissance, nommage, vérification avant envoi), nouveaux types de documents et de demandes
Co-Authored-By: Claude Sonnet 5.5 <noreply@anthropic.com>
Claude-Session: https://claude.ai/code/session_01X2N9yuBhmf2MHQAUEM1VoV
</commit_message>
<xml_diff>
--- a/Kit-Sijil/Sijil-Manuel.docx
+++ b/Kit-Sijil/Sijil-Manuel.docx
@@ -78,7 +78,7 @@
         <w:rPr>
           <w:color w:val="6B7785"/>
         </w:rPr>
-        <w:t>Version 3.20 · Octobre 2026</w:t>
+        <w:t>Version 3.21 · Octobre 2026</w:t>
       </w:r>
     </w:p>
     <w:p/>
@@ -3066,7 +3066,12 @@
     </w:p>
     <w:p>
       <w:r>
-        <w:t>Dans « Documents », choisissez l'agent et déposez le fichier (6 Mo maximum). Sijil reconnaît le type et la période, renomme le fichier (par exemple FDP_Nom_mars2026) et le range dans Google Drive, dossier « Documents / nom de l'agent ». L'agent est prévenu. « Corriger » change le type ou la période si la reconnaissance se trompe.</w:t>
+        <w:t>Dans « Documents », déposez plusieurs fichiers d'un coup (6 Mo maximum chacun). Sijil reconnaît l'agent, le type et les dates, puis propose le nom : TC_NOM_Prenom_2026-02-14 (titre de congé), NOM_Prenom_FDP_Mars2026 (fiche de paie), NOM_Prenom_2026-04-04_Contrat, NOM_Prenom_AttestationCNAS_n°_2026-05-07, NOM_Prenom_MAJCNAS_Janvier2026_Mars2026, NOM_Prenom_AttestationTravail_2026-05-04 et NOM_Prenom_AttestationEmoluments_Janvier2026_Mars2026. Les photos et scans peuvent être convertis en PDF.</w:t>
+      </w:r>
+    </w:p>
+    <w:p>
+      <w:r>
+        <w:t>Rien n'est envoyé tout de suite : la liste « À vérifier avant envoi » permet de corriger l'agent, le type, les dates et le nom. Après votre accord, chaque fichier est rangé dans Google Drive, dossier « Documents / nom de l'agent », et l'agent reçoit un e-mail récapitulatif. « Corriger » change ensuite le type ou la période si besoin.</w:t>
       </w:r>
     </w:p>
     <w:p>

</xml_diff>

<commit_message>
v3.22.0 : aperçu des documents avant envoi et dans la liste
Co-Authored-By: Claude Sonnet 5.5 <noreply@anthropic.com>
Claude-Session: https://claude.ai/code/session_01X2N9yuBhmf2MHQAUEM1VoV
</commit_message>
<xml_diff>
--- a/Kit-Sijil/Sijil-Manuel.docx
+++ b/Kit-Sijil/Sijil-Manuel.docx
@@ -78,7 +78,7 @@
         <w:rPr>
           <w:color w:val="6B7785"/>
         </w:rPr>
-        <w:t>Version 3.21 · Octobre 2026</w:t>
+        <w:t>Version 3.22 · Octobre 2026</w:t>
       </w:r>
     </w:p>
     <w:p/>
@@ -3071,7 +3071,7 @@
     </w:p>
     <w:p>
       <w:r>
-        <w:t>Rien n'est envoyé tout de suite : la liste « À vérifier avant envoi » permet de corriger l'agent, le type, les dates et le nom. Après votre accord, chaque fichier est rangé dans Google Drive, dossier « Documents / nom de l'agent », et l'agent reçoit un e-mail récapitulatif. « Corriger » change ensuite le type ou la période si besoin.</w:t>
+        <w:t>Rien n'est envoyé tout de suite : la liste « À vérifier avant envoi » permet de corriger l'agent, le type, les dates et le nom. Le bouton « Aperçu » montre le document (PDF ou image) pour vérifier l'agent et le fichier. Après votre accord, chaque fichier est rangé dans Google Drive, dossier « Documents / nom de l'agent », et l'agent reçoit un e-mail récapitulatif. « Corriger » change ensuite le type ou la période si besoin.</w:t>
       </w:r>
     </w:p>
     <w:p>

</xml_diff>

<commit_message>
v3.23.0 : connexion par utilisateur (support), carte Version site/serveur, documents jusqu'à 10 Mo
Co-Authored-By: Claude Sonnet 5.5 <noreply@anthropic.com>
Claude-Session: https://claude.ai/code/session_01X2N9yuBhmf2MHQAUEM1VoV
</commit_message>
<xml_diff>
--- a/Kit-Sijil/Sijil-Manuel.docx
+++ b/Kit-Sijil/Sijil-Manuel.docx
@@ -78,7 +78,7 @@
         <w:rPr>
           <w:color w:val="6B7785"/>
         </w:rPr>
-        <w:t>Version 3.22 · Octobre 2026</w:t>
+        <w:t>Version 3.23 · Octobre 2026</w:t>
       </w:r>
     </w:p>
     <w:p/>
@@ -3066,7 +3066,7 @@
     </w:p>
     <w:p>
       <w:r>
-        <w:t>Dans « Documents », déposez plusieurs fichiers d'un coup (6 Mo maximum chacun). Sijil reconnaît l'agent, le type et les dates, puis propose le nom : TC_NOM_Prenom_2026-02-14 (titre de congé), NOM_Prenom_FDP_Mars2026 (fiche de paie), NOM_Prenom_2026-04-04_Contrat, NOM_Prenom_AttestationCNAS_n°_2026-05-07, NOM_Prenom_MAJCNAS_Janvier2026_Mars2026, NOM_Prenom_AttestationTravail_2026-05-04 et NOM_Prenom_AttestationEmoluments_Janvier2026_Mars2026. Les photos et scans peuvent être convertis en PDF.</w:t>
+        <w:t>Dans « Documents », déposez plusieurs fichiers d'un coup (10 Mo maximum chacun). Sijil reconnaît l'agent, le type et les dates, puis propose le nom : TC_NOM_Prenom_2026-02-14 (titre de congé), NOM_Prenom_FDP_Mars2026 (fiche de paie), NOM_Prenom_2026-04-04_Contrat, NOM_Prenom_AttestationCNAS_n°_2026-05-07, NOM_Prenom_MAJCNAS_Janvier2026_Mars2026, NOM_Prenom_AttestationTravail_2026-05-04 et NOM_Prenom_AttestationEmoluments_Janvier2026_Mars2026. Les photos et scans peuvent être convertis en PDF.</w:t>
       </w:r>
     </w:p>
     <w:p>
@@ -3478,7 +3478,7 @@
     </w:p>
     <w:p>
       <w:r>
-        <w:t>Le compte éditeur a, dans l'en-tête, un sélecteur d'entreprise. Choisir un client ouvre son espace avec tous les droits de son administrateur (onglets, pointages, mots de passe, réglages). Un bandeau rappelle le mode support et « Retour à l'administration » ramène à la console. Chaque accès est noté dans le journal des connexions.</w:t>
+        <w:t>Le compte éditeur a, dans l'en-tête, un sélecteur d'entreprise. Choisir un client ouvre son espace avec tous les droits de son administrateur (onglets, pointages, mots de passe, réglages). Un bandeau rappelle le mode support et « Retour à l'administration » ramène à la console. Chaque accès est noté dans le journal des connexions. Une deuxième liste permet de choisir un utilisateur de l'entreprise et de se connecter à sa place pour intervenir. La carte « Version » de l'onglet Clients indique si le site et le serveur sont à jour.</w:t>
       </w:r>
     </w:p>
     <w:p>
@@ -3997,7 +3997,7 @@
         <w:pStyle w:val="ListBullet"/>
       </w:pPr>
       <w:r>
-        <w:t>Images et documents : les logos sont vérifiés (vrai format PNG, JPG ou GIF), les documents ne dépassent pas 6 Mo.</w:t>
+        <w:t>Images et documents : les logos sont vérifiés (vrai format PNG, JPG ou GIF), les documents ne dépassent pas 10 Mo.</w:t>
       </w:r>
     </w:p>
     <w:p>

</xml_diff>

<commit_message>
v3.24.0 : détection des doublons (même fichier, même type et période)
Co-Authored-By: Claude Sonnet 5.5 <noreply@anthropic.com>
Claude-Session: https://claude.ai/code/session_01X2N9yuBhmf2MHQAUEM1VoV
</commit_message>
<xml_diff>
--- a/Kit-Sijil/Sijil-Manuel.docx
+++ b/Kit-Sijil/Sijil-Manuel.docx
@@ -78,7 +78,7 @@
         <w:rPr>
           <w:color w:val="6B7785"/>
         </w:rPr>
-        <w:t>Version 3.23.1 · Octobre 2026</w:t>
+        <w:t>Version 3.24 · Octobre 2026</w:t>
       </w:r>
     </w:p>
     <w:p/>
@@ -3071,7 +3071,7 @@
     </w:p>
     <w:p>
       <w:r>
-        <w:t>Rien n'est envoyé tout de suite : la liste « À vérifier avant envoi » permet de corriger l'agent, le type, les dates et le nom. Le bouton « Aperçu » montre le document (PDF ou image) pour vérifier l'agent et le fichier. Après votre accord, chaque fichier est rangé dans Google Drive, dossier « Documents / nom de l'agent », et l'agent reçoit un e-mail récapitulatif. « Corriger » change ensuite le type ou la période si besoin.</w:t>
+        <w:t>Rien n'est envoyé tout de suite : la liste « À vérifier avant envoi » permet de corriger l'agent, le type, les dates et le nom. Un même fichier déposé deux fois est signalé en rouge (« Doublon ») et son envoi demande une confirmation ; un document du même type et de la même période qu'un document déjà classé reçoit un avertissement. Le bouton « Aperçu » montre le document (PDF ou image) pour vérifier l'agent et le fichier. Après votre accord, chaque fichier est rangé dans Google Drive, dossier « Documents / nom de l'agent », et l'agent reçoit un e-mail récapitulatif. « Corriger » change ensuite le type ou la période si besoin.</w:t>
       </w:r>
     </w:p>
     <w:p>

</xml_diff>

<commit_message>
v3.33.0 : signature JawlaDev partout (pied de page, accueil, confidentialité, e-mails, manuel, présentation) avec lien vers le portfolio
Co-Authored-By: Claude Sonnet 5.5 <noreply@anthropic.com>
Claude-Session: https://claude.ai/code/session_01X2N9yuBhmf2MHQAUEM1VoV
</commit_message>
<xml_diff>
--- a/Kit-Sijil/Sijil-Manuel.docx
+++ b/Kit-Sijil/Sijil-Manuel.docx
@@ -78,7 +78,7 @@
         <w:rPr>
           <w:color w:val="6B7785"/>
         </w:rPr>
-        <w:t>Version 3.25.1 · Octobre 2026</w:t>
+        <w:t>Version 3.32.1 · Octobre 2026</w:t>
       </w:r>
     </w:p>
     <w:p/>
@@ -4331,7 +4331,7 @@
         <w:color w:val="6B7785"/>
         <w:sz w:val="16"/>
       </w:rPr>
-      <w:t xml:space="preserve">© 2026 Rayane M. — Tous droits réservés · Page </w:t>
+      <w:t xml:space="preserve">© 2026 JawlaDev — Tous droits réservés · Page </w:t>
     </w:r>
     <w:r>
       <w:rPr>

</xml_diff>

<commit_message>
v3.41.0 : module Facturation activable par l'administrateur ; kit commercial mis à jour (rotations, personnel et matériel, de A à Z)
Co-Authored-By: Claude Sonnet 5.5 <noreply@anthropic.com>
Claude-Session: https://claude.ai/code/session_01X2N9yuBhmf2MHQAUEM1VoV
</commit_message>
<xml_diff>
--- a/Kit-Sijil/Sijil-Manuel.docx
+++ b/Kit-Sijil/Sijil-Manuel.docx
@@ -67,7 +67,7 @@
           <w:color w:val="2FB5B4"/>
           <w:sz w:val="32"/>
         </w:rPr>
-        <w:t>Gestion du temps de travail</w:t>
+        <w:t>Gestion du temps de travail et des rotations</w:t>
       </w:r>
     </w:p>
     <w:p>
@@ -78,7 +78,7 @@
         <w:rPr>
           <w:color w:val="6B7785"/>
         </w:rPr>
-        <w:t>Version 3.32.1 · Octobre 2026</w:t>
+        <w:t>Version 3.41.0 · Octobre 2026</w:t>
       </w:r>
     </w:p>
     <w:p/>
@@ -504,7 +504,7 @@
     </w:p>
     <w:p>
       <w:r>
-        <w:t>Sijil gère la mise à disposition de personnel et la prestation de services de A à Z : du bordereau des prix du contrat jusqu'à l'édition de l'attachement et de la facture, en passant par les agents, les véhicules, le pointage, les congés et les documents. Elle remplace les fichiers Excel et les messages dispersés par un outil unique, pour le personnel en rotation sur site : 28 jours de travail puis 28 jours de repos, 14/14, 6/2…</w:t>
+        <w:t>Sijil est une gestion du temps de travail qui prend en charge les rotations, et qui gère la mise à disposition du personnel et du matériel de prestation de services de A à Z : du bordereau des prix du contrat jusqu'à l'édition de l'attachement et de la facture (la facturation est un module que l'administrateur active ou désactive), en passant par les agents, les véhicules, le pointage, les congés et les documents. Elle remplace les fichiers Excel et les messages dispersés par un outil unique, pour le personnel en rotation sur site : 28 jours de travail puis 28 jours de repos, 14/14, 6/2…</w:t>
       </w:r>
     </w:p>
     <w:p>
@@ -719,7 +719,7 @@
                 <w:b/>
                 <w:sz w:val="20"/>
               </w:rPr>
-              <w:t>6. Facture</w:t>
+              <w:t>6. Facture (module optionnel)</w:t>
             </w:r>
           </w:p>
         </w:tc>
@@ -732,7 +732,7 @@
               <w:rPr>
                 <w:sz w:val="20"/>
               </w:rPr>
-              <w:t>La facture est établie à partir de l'attachement validé, avec ses PDF et Excel, son historique et le reste à facturer.</w:t>
+              <w:t>Si l'administrateur a activé la facturation (Setup → Contrat), la facture est établie à partir de l'attachement validé, avec ses PDF et Excel, son historique et le reste à facturer.</w:t>
             </w:r>
           </w:p>
         </w:tc>
@@ -3495,6 +3495,11 @@
       </w:r>
     </w:p>
     <w:p>
+      <w:r>
+        <w:t>Module Facturation : l'administrateur peut l'activer ou le désactiver dans Setup → Contrat (« Module Facturation »). Désactivé, Sijil s'arrête à l'attachement : la partie « 3. Facture » disparaît des exports et de l'historique des contrats, et l'édition de factures est refusée par le serveur. Les factures déjà établies sont conservées et réapparaissent si le module est réactivé.</w:t>
+      </w:r>
+    </w:p>
+    <w:p>
       <w:pPr>
         <w:keepNext/>
         <w:spacing w:after="40"/>

</xml_diff>

<commit_message>
Kit commercial : pointage du matériel (camions, rétrochargeur, 4x4) dans la présentation, le manuel et les e-mails ; jeu de démonstration enrichi
Co-Authored-By: Claude Sonnet 5.5 <noreply@anthropic.com>
Claude-Session: https://claude.ai/code/session_01X2N9yuBhmf2MHQAUEM1VoV
</commit_message>
<xml_diff>
--- a/Kit-Sijil/Sijil-Manuel.docx
+++ b/Kit-Sijil/Sijil-Manuel.docx
@@ -329,6 +329,18 @@
           <w:sz w:val="20"/>
         </w:rPr>
         <w:t>Les agents et les véhicules</w:t>
+      </w:r>
+    </w:p>
+    <w:p>
+      <w:pPr>
+        <w:spacing w:after="20"/>
+        <w:ind w:left="454"/>
+      </w:pPr>
+      <w:r>
+        <w:rPr>
+          <w:sz w:val="20"/>
+        </w:rPr>
+        <w:t>Le pointage du matériel</w:t>
       </w:r>
     </w:p>
     <w:p>
@@ -1413,7 +1425,7 @@
                 <w:color w:val="0E4377"/>
                 <w:sz w:val="19"/>
               </w:rPr>
-              <w:t>✔ Véhicules mis à disposition</w:t>
+              <w:t>✔ Matériel mis à disposition</w:t>
             </w:r>
           </w:p>
         </w:tc>
@@ -1427,7 +1439,7 @@
               <w:rPr>
                 <w:sz w:val="19"/>
               </w:rPr>
-              <w:t>Pointés comme des agents, sans compte de connexion, avec un effectif qui suit le contrat.</w:t>
+              <w:t>Camions, rétrochargeurs, véhicules 4x4… pointés comme des agents, sans compte de connexion, avec un effectif qui suit le contrat ; leurs jours alimentent l'attachement.</w:t>
             </w:r>
           </w:p>
         </w:tc>
@@ -2994,6 +3006,191 @@
         <w:pStyle w:val="Heading2"/>
       </w:pPr>
       <w:r>
+        <w:t>Le pointage du matériel</w:t>
+      </w:r>
+    </w:p>
+    <w:p>
+      <w:r>
+        <w:t>Le matériel mis à disposition (par exemple un camion 2,5 tonnes, un rétrochargeur ou un véhicule 4x4) se gère comme le personnel. Dans « Agents », choisissez le type « Véhicule », saisissez son immatriculation et son modèle, puis son contrat et sa fonction (celle du bordereau des prix). Il n'a pas de compte de connexion. Le nombre d'engins est borné par le contrat.</w:t>
+      </w:r>
+    </w:p>
+    <w:p>
+      <w:pPr>
+        <w:keepNext/>
+        <w:spacing w:after="40"/>
+        <w:jc w:val="center"/>
+      </w:pPr>
+      <w:r>
+        <w:drawing>
+          <wp:inline xmlns:a="http://schemas.openxmlformats.org/drawingml/2006/main" xmlns:pic="http://schemas.openxmlformats.org/drawingml/2006/picture">
+            <wp:extent cx="5580000" cy="4654471"/>
+            <wp:docPr id="19" name="Picture 19"/>
+            <wp:cNvGraphicFramePr>
+              <a:graphicFrameLocks noChangeAspect="1"/>
+            </wp:cNvGraphicFramePr>
+            <a:graphic>
+              <a:graphicData uri="http://schemas.openxmlformats.org/drawingml/2006/picture">
+                <pic:pic>
+                  <pic:nvPicPr>
+                    <pic:cNvPr id="0" name="22-materiel-agents.png"/>
+                    <pic:cNvPicPr/>
+                  </pic:nvPicPr>
+                  <pic:blipFill>
+                    <a:blip r:embed="rId28"/>
+                    <a:stretch>
+                      <a:fillRect/>
+                    </a:stretch>
+                  </pic:blipFill>
+                  <pic:spPr>
+                    <a:xfrm>
+                      <a:off x="0" y="0"/>
+                      <a:ext cx="5580000" cy="4654471"/>
+                    </a:xfrm>
+                    <a:prstGeom prst="rect"/>
+                  </pic:spPr>
+                </pic:pic>
+              </a:graphicData>
+            </a:graphic>
+          </wp:inline>
+        </w:drawing>
+      </w:r>
+    </w:p>
+    <w:p>
+      <w:pPr>
+        <w:jc w:val="center"/>
+      </w:pPr>
+      <w:r>
+        <w:rPr>
+          <w:i/>
+          <w:color w:val="6B7785"/>
+          <w:sz w:val="18"/>
+        </w:rPr>
+        <w:t>Personnel et matériel dans la même liste ; le badge VH repère les véhicules.</w:t>
+      </w:r>
+    </w:p>
+    <w:p>
+      <w:r>
+        <w:t>Dans « Pointage global » (ou « Mon groupe »), chaque engin a sa ligne : T quand il est en service, R à l'arrêt, ABS en panne. Les prévisions, les couleurs et les compteurs sont ceux du personnel.</w:t>
+      </w:r>
+    </w:p>
+    <w:p>
+      <w:pPr>
+        <w:keepNext/>
+        <w:spacing w:after="40"/>
+        <w:jc w:val="center"/>
+      </w:pPr>
+      <w:r>
+        <w:drawing>
+          <wp:inline xmlns:a="http://schemas.openxmlformats.org/drawingml/2006/main" xmlns:pic="http://schemas.openxmlformats.org/drawingml/2006/picture">
+            <wp:extent cx="5580000" cy="4104519"/>
+            <wp:docPr id="20" name="Picture 20"/>
+            <wp:cNvGraphicFramePr>
+              <a:graphicFrameLocks noChangeAspect="1"/>
+            </wp:cNvGraphicFramePr>
+            <a:graphic>
+              <a:graphicData uri="http://schemas.openxmlformats.org/drawingml/2006/picture">
+                <pic:pic>
+                  <pic:nvPicPr>
+                    <pic:cNvPr id="0" name="15-materiel-pointage.png"/>
+                    <pic:cNvPicPr/>
+                  </pic:nvPicPr>
+                  <pic:blipFill>
+                    <a:blip r:embed="rId29"/>
+                    <a:stretch>
+                      <a:fillRect/>
+                    </a:stretch>
+                  </pic:blipFill>
+                  <pic:spPr>
+                    <a:xfrm>
+                      <a:off x="0" y="0"/>
+                      <a:ext cx="5580000" cy="4104519"/>
+                    </a:xfrm>
+                    <a:prstGeom prst="rect"/>
+                  </pic:spPr>
+                </pic:pic>
+              </a:graphicData>
+            </a:graphic>
+          </wp:inline>
+        </w:drawing>
+      </w:r>
+    </w:p>
+    <w:p>
+      <w:pPr>
+        <w:jc w:val="center"/>
+      </w:pPr>
+      <w:r>
+        <w:rPr>
+          <w:i/>
+          <w:color w:val="6B7785"/>
+          <w:sz w:val="18"/>
+        </w:rPr>
+        <w:t>Le pointage du mois : personnel et matériel dans la même grille.</w:t>
+      </w:r>
+    </w:p>
+    <w:p>
+      <w:r>
+        <w:t>À la fin du mois, l'attachement reprend les jours pointés de chaque fonction du bordereau, personnel comme matériel, avec le prix unitaire du contrat et le total HT.</w:t>
+      </w:r>
+    </w:p>
+    <w:p>
+      <w:pPr>
+        <w:keepNext/>
+        <w:spacing w:after="40"/>
+        <w:jc w:val="center"/>
+      </w:pPr>
+      <w:r>
+        <w:drawing>
+          <wp:inline xmlns:a="http://schemas.openxmlformats.org/drawingml/2006/main" xmlns:pic="http://schemas.openxmlformats.org/drawingml/2006/picture">
+            <wp:extent cx="5580000" cy="3049327"/>
+            <wp:docPr id="21" name="Picture 21"/>
+            <wp:cNvGraphicFramePr>
+              <a:graphicFrameLocks noChangeAspect="1"/>
+            </wp:cNvGraphicFramePr>
+            <a:graphic>
+              <a:graphicData uri="http://schemas.openxmlformats.org/drawingml/2006/picture">
+                <pic:pic>
+                  <pic:nvPicPr>
+                    <pic:cNvPr id="0" name="51-materiel-attachement.png"/>
+                    <pic:cNvPicPr/>
+                  </pic:nvPicPr>
+                  <pic:blipFill>
+                    <a:blip r:embed="rId30"/>
+                    <a:stretch>
+                      <a:fillRect/>
+                    </a:stretch>
+                  </pic:blipFill>
+                  <pic:spPr>
+                    <a:xfrm>
+                      <a:off x="0" y="0"/>
+                      <a:ext cx="5580000" cy="3049327"/>
+                    </a:xfrm>
+                    <a:prstGeom prst="rect"/>
+                  </pic:spPr>
+                </pic:pic>
+              </a:graphicData>
+            </a:graphic>
+          </wp:inline>
+        </w:drawing>
+      </w:r>
+    </w:p>
+    <w:p>
+      <w:pPr>
+        <w:jc w:val="center"/>
+      </w:pPr>
+      <w:r>
+        <w:rPr>
+          <w:i/>
+          <w:color w:val="6B7785"/>
+          <w:sz w:val="18"/>
+        </w:rPr>
+        <w:t>L'attachement du mois : les lignes « VH » sont le matériel.</w:t>
+      </w:r>
+    </w:p>
+    <w:p>
+      <w:pPr>
+        <w:pStyle w:val="Heading2"/>
+      </w:pPr>
+      <w:r>
         <w:t>Les demandes de l'équipe</w:t>
       </w:r>
     </w:p>
@@ -3012,7 +3209,7 @@
         <w:drawing>
           <wp:inline xmlns:a="http://schemas.openxmlformats.org/drawingml/2006/main" xmlns:pic="http://schemas.openxmlformats.org/drawingml/2006/picture">
             <wp:extent cx="5580000" cy="3364412"/>
-            <wp:docPr id="19" name="Picture 19"/>
+            <wp:docPr id="22" name="Picture 22"/>
             <wp:cNvGraphicFramePr>
               <a:graphicFrameLocks noChangeAspect="1"/>
             </wp:cNvGraphicFramePr>
@@ -3024,7 +3221,7 @@
                     <pic:cNvPicPr/>
                   </pic:nvPicPr>
                   <pic:blipFill>
-                    <a:blip r:embed="rId28"/>
+                    <a:blip r:embed="rId31"/>
                     <a:stretch>
                       <a:fillRect/>
                     </a:stretch>
@@ -3084,7 +3281,7 @@
         <w:drawing>
           <wp:inline xmlns:a="http://schemas.openxmlformats.org/drawingml/2006/main" xmlns:pic="http://schemas.openxmlformats.org/drawingml/2006/picture">
             <wp:extent cx="5580000" cy="3364412"/>
-            <wp:docPr id="20" name="Picture 20"/>
+            <wp:docPr id="23" name="Picture 23"/>
             <wp:cNvGraphicFramePr>
               <a:graphicFrameLocks noChangeAspect="1"/>
             </wp:cNvGraphicFramePr>
@@ -3096,7 +3293,7 @@
                     <pic:cNvPicPr/>
                   </pic:nvPicPr>
                   <pic:blipFill>
-                    <a:blip r:embed="rId29"/>
+                    <a:blip r:embed="rId32"/>
                     <a:stretch>
                       <a:fillRect/>
                     </a:stretch>
@@ -3169,7 +3366,7 @@
         <w:drawing>
           <wp:inline xmlns:a="http://schemas.openxmlformats.org/drawingml/2006/main" xmlns:pic="http://schemas.openxmlformats.org/drawingml/2006/picture">
             <wp:extent cx="5580000" cy="4226029"/>
-            <wp:docPr id="21" name="Picture 21"/>
+            <wp:docPr id="24" name="Picture 24"/>
             <wp:cNvGraphicFramePr>
               <a:graphicFrameLocks noChangeAspect="1"/>
             </wp:cNvGraphicFramePr>
@@ -3181,7 +3378,7 @@
                     <pic:cNvPicPr/>
                   </pic:nvPicPr>
                   <pic:blipFill>
-                    <a:blip r:embed="rId30"/>
+                    <a:blip r:embed="rId33"/>
                     <a:stretch>
                       <a:fillRect/>
                     </a:stretch>
@@ -3223,7 +3420,7 @@
         <w:drawing>
           <wp:inline xmlns:a="http://schemas.openxmlformats.org/drawingml/2006/main" xmlns:pic="http://schemas.openxmlformats.org/drawingml/2006/picture">
             <wp:extent cx="5580000" cy="2584853"/>
-            <wp:docPr id="22" name="Picture 22"/>
+            <wp:docPr id="25" name="Picture 25"/>
             <wp:cNvGraphicFramePr>
               <a:graphicFrameLocks noChangeAspect="1"/>
             </wp:cNvGraphicFramePr>
@@ -3235,7 +3432,7 @@
                     <pic:cNvPicPr/>
                   </pic:nvPicPr>
                   <pic:blipFill>
-                    <a:blip r:embed="rId31"/>
+                    <a:blip r:embed="rId34"/>
                     <a:stretch>
                       <a:fillRect/>
                     </a:stretch>
@@ -3290,7 +3487,7 @@
         <w:drawing>
           <wp:inline xmlns:a="http://schemas.openxmlformats.org/drawingml/2006/main" xmlns:pic="http://schemas.openxmlformats.org/drawingml/2006/picture">
             <wp:extent cx="5580000" cy="4201412"/>
-            <wp:docPr id="23" name="Picture 23"/>
+            <wp:docPr id="26" name="Picture 26"/>
             <wp:cNvGraphicFramePr>
               <a:graphicFrameLocks noChangeAspect="1"/>
             </wp:cNvGraphicFramePr>
@@ -3302,7 +3499,7 @@
                     <pic:cNvPicPr/>
                   </pic:nvPicPr>
                   <pic:blipFill>
-                    <a:blip r:embed="rId32"/>
+                    <a:blip r:embed="rId35"/>
                     <a:stretch>
                       <a:fillRect/>
                     </a:stretch>
@@ -3344,7 +3541,7 @@
         <w:drawing>
           <wp:inline xmlns:a="http://schemas.openxmlformats.org/drawingml/2006/main" xmlns:pic="http://schemas.openxmlformats.org/drawingml/2006/picture">
             <wp:extent cx="5580000" cy="4246544"/>
-            <wp:docPr id="24" name="Picture 24"/>
+            <wp:docPr id="27" name="Picture 27"/>
             <wp:cNvGraphicFramePr>
               <a:graphicFrameLocks noChangeAspect="1"/>
             </wp:cNvGraphicFramePr>
@@ -3356,7 +3553,7 @@
                     <pic:cNvPicPr/>
                   </pic:nvPicPr>
                   <pic:blipFill>
-                    <a:blip r:embed="rId33"/>
+                    <a:blip r:embed="rId36"/>
                     <a:stretch>
                       <a:fillRect/>
                     </a:stretch>
@@ -3411,7 +3608,7 @@
         <w:drawing>
           <wp:inline xmlns:a="http://schemas.openxmlformats.org/drawingml/2006/main" xmlns:pic="http://schemas.openxmlformats.org/drawingml/2006/picture">
             <wp:extent cx="5580000" cy="5456912"/>
-            <wp:docPr id="25" name="Picture 25"/>
+            <wp:docPr id="28" name="Picture 28"/>
             <wp:cNvGraphicFramePr>
               <a:graphicFrameLocks noChangeAspect="1"/>
             </wp:cNvGraphicFramePr>
@@ -3423,7 +3620,7 @@
                     <pic:cNvPicPr/>
                   </pic:nvPicPr>
                   <pic:blipFill>
-                    <a:blip r:embed="rId34"/>
+                    <a:blip r:embed="rId37"/>
                     <a:stretch>
                       <a:fillRect/>
                     </a:stretch>
@@ -3509,7 +3706,7 @@
         <w:drawing>
           <wp:inline xmlns:a="http://schemas.openxmlformats.org/drawingml/2006/main" xmlns:pic="http://schemas.openxmlformats.org/drawingml/2006/picture">
             <wp:extent cx="5580000" cy="4267059"/>
-            <wp:docPr id="26" name="Picture 26"/>
+            <wp:docPr id="29" name="Picture 29"/>
             <wp:cNvGraphicFramePr>
               <a:graphicFrameLocks noChangeAspect="1"/>
             </wp:cNvGraphicFramePr>
@@ -3521,7 +3718,7 @@
                     <pic:cNvPicPr/>
                   </pic:nvPicPr>
                   <pic:blipFill>
-                    <a:blip r:embed="rId35"/>
+                    <a:blip r:embed="rId38"/>
                     <a:stretch>
                       <a:fillRect/>
                     </a:stretch>
@@ -3586,7 +3783,7 @@
         <w:drawing>
           <wp:inline xmlns:a="http://schemas.openxmlformats.org/drawingml/2006/main" xmlns:pic="http://schemas.openxmlformats.org/drawingml/2006/picture">
             <wp:extent cx="5580000" cy="3364412"/>
-            <wp:docPr id="27" name="Picture 27"/>
+            <wp:docPr id="30" name="Picture 30"/>
             <wp:cNvGraphicFramePr>
               <a:graphicFrameLocks noChangeAspect="1"/>
             </wp:cNvGraphicFramePr>
@@ -3595,173 +3792,6 @@
                 <pic:pic>
                   <pic:nvPicPr>
                     <pic:cNvPr id="0" name="80-client-pointage.png"/>
-                    <pic:cNvPicPr/>
-                  </pic:nvPicPr>
-                  <pic:blipFill>
-                    <a:blip r:embed="rId36"/>
-                    <a:stretch>
-                      <a:fillRect/>
-                    </a:stretch>
-                  </pic:blipFill>
-                  <pic:spPr>
-                    <a:xfrm>
-                      <a:off x="0" y="0"/>
-                      <a:ext cx="5580000" cy="3364412"/>
-                    </a:xfrm>
-                    <a:prstGeom prst="rect"/>
-                  </pic:spPr>
-                </pic:pic>
-              </a:graphicData>
-            </a:graphic>
-          </wp:inline>
-        </w:drawing>
-      </w:r>
-    </w:p>
-    <w:p>
-      <w:pPr>
-        <w:jc w:val="center"/>
-      </w:pPr>
-      <w:r>
-        <w:rPr>
-          <w:i/>
-          <w:color w:val="6B7785"/>
-          <w:sz w:val="18"/>
-        </w:rPr>
-        <w:t>Le pointage vu par le client.</w:t>
-      </w:r>
-    </w:p>
-    <w:p>
-      <w:r>
-        <w:t>Pour faire une remarque, le client clique sur un jour du pointage et l'écrit. Elle est signalée par un repère rouge dans la grille et envoyée par e-mail au responsable d’équipe.</w:t>
-      </w:r>
-    </w:p>
-    <w:p>
-      <w:pPr>
-        <w:keepNext/>
-        <w:spacing w:after="40"/>
-        <w:jc w:val="center"/>
-      </w:pPr>
-      <w:r>
-        <w:drawing>
-          <wp:inline xmlns:a="http://schemas.openxmlformats.org/drawingml/2006/main" xmlns:pic="http://schemas.openxmlformats.org/drawingml/2006/picture">
-            <wp:extent cx="5580000" cy="3364412"/>
-            <wp:docPr id="28" name="Picture 28"/>
-            <wp:cNvGraphicFramePr>
-              <a:graphicFrameLocks noChangeAspect="1"/>
-            </wp:cNvGraphicFramePr>
-            <a:graphic>
-              <a:graphicData uri="http://schemas.openxmlformats.org/drawingml/2006/picture">
-                <pic:pic>
-                  <pic:nvPicPr>
-                    <pic:cNvPr id="0" name="81-client-remarque.png"/>
-                    <pic:cNvPicPr/>
-                  </pic:nvPicPr>
-                  <pic:blipFill>
-                    <a:blip r:embed="rId37"/>
-                    <a:stretch>
-                      <a:fillRect/>
-                    </a:stretch>
-                  </pic:blipFill>
-                  <pic:spPr>
-                    <a:xfrm>
-                      <a:off x="0" y="0"/>
-                      <a:ext cx="5580000" cy="3364412"/>
-                    </a:xfrm>
-                    <a:prstGeom prst="rect"/>
-                  </pic:spPr>
-                </pic:pic>
-              </a:graphicData>
-            </a:graphic>
-          </wp:inline>
-        </w:drawing>
-      </w:r>
-    </w:p>
-    <w:p>
-      <w:pPr>
-        <w:jc w:val="center"/>
-      </w:pPr>
-      <w:r>
-        <w:rPr>
-          <w:i/>
-          <w:color w:val="6B7785"/>
-          <w:sz w:val="18"/>
-        </w:rPr>
-        <w:t>Le client laisse une remarque sur un jour.</w:t>
-      </w:r>
-    </w:p>
-    <w:p>
-      <w:pPr>
-        <w:keepNext/>
-        <w:spacing w:after="40"/>
-        <w:jc w:val="center"/>
-      </w:pPr>
-      <w:r>
-        <w:drawing>
-          <wp:inline xmlns:a="http://schemas.openxmlformats.org/drawingml/2006/main" xmlns:pic="http://schemas.openxmlformats.org/drawingml/2006/picture">
-            <wp:extent cx="5580000" cy="3364412"/>
-            <wp:docPr id="29" name="Picture 29"/>
-            <wp:cNvGraphicFramePr>
-              <a:graphicFrameLocks noChangeAspect="1"/>
-            </wp:cNvGraphicFramePr>
-            <a:graphic>
-              <a:graphicData uri="http://schemas.openxmlformats.org/drawingml/2006/picture">
-                <pic:pic>
-                  <pic:nvPicPr>
-                    <pic:cNvPr id="0" name="83-remarque-prestataire.png"/>
-                    <pic:cNvPicPr/>
-                  </pic:nvPicPr>
-                  <pic:blipFill>
-                    <a:blip r:embed="rId38"/>
-                    <a:stretch>
-                      <a:fillRect/>
-                    </a:stretch>
-                  </pic:blipFill>
-                  <pic:spPr>
-                    <a:xfrm>
-                      <a:off x="0" y="0"/>
-                      <a:ext cx="5580000" cy="3364412"/>
-                    </a:xfrm>
-                    <a:prstGeom prst="rect"/>
-                  </pic:spPr>
-                </pic:pic>
-              </a:graphicData>
-            </a:graphic>
-          </wp:inline>
-        </w:drawing>
-      </w:r>
-    </w:p>
-    <w:p>
-      <w:pPr>
-        <w:jc w:val="center"/>
-      </w:pPr>
-      <w:r>
-        <w:rPr>
-          <w:i/>
-          <w:color w:val="6B7785"/>
-          <w:sz w:val="18"/>
-        </w:rPr>
-        <w:t>Le prestataire voit la remarque, la marque « vu » et peut répondre.</w:t>
-      </w:r>
-    </w:p>
-    <w:p>
-      <w:pPr>
-        <w:keepNext/>
-        <w:spacing w:after="40"/>
-        <w:jc w:val="center"/>
-      </w:pPr>
-      <w:r>
-        <w:drawing>
-          <wp:inline xmlns:a="http://schemas.openxmlformats.org/drawingml/2006/main" xmlns:pic="http://schemas.openxmlformats.org/drawingml/2006/picture">
-            <wp:extent cx="5580000" cy="3364412"/>
-            <wp:docPr id="30" name="Picture 30"/>
-            <wp:cNvGraphicFramePr>
-              <a:graphicFrameLocks noChangeAspect="1"/>
-            </wp:cNvGraphicFramePr>
-            <a:graphic>
-              <a:graphicData uri="http://schemas.openxmlformats.org/drawingml/2006/picture">
-                <pic:pic>
-                  <pic:nvPicPr>
-                    <pic:cNvPr id="0" name="82-client-contrat.png"/>
                     <pic:cNvPicPr/>
                   </pic:nvPicPr>
                   <pic:blipFill>
@@ -3794,25 +3824,12 @@
           <w:color w:val="6B7785"/>
           <w:sz w:val="18"/>
         </w:rPr>
-        <w:t>Le contrat et les attachements, vus par le client.</w:t>
+        <w:t>Le pointage vu par le client.</w:t>
       </w:r>
     </w:p>
     <w:p>
       <w:r>
-        <w:br w:type="page"/>
-      </w:r>
-    </w:p>
-    <w:p>
-      <w:pPr>
-        <w:pStyle w:val="Heading1"/>
-      </w:pPr>
-      <w:r>
-        <w:t>7. Aide et nouveautés</w:t>
-      </w:r>
-    </w:p>
-    <w:p>
-      <w:r>
-        <w:t>L'onglet « Aide » explique chaque fonction, par profil, avec une barre de recherche, en français, en arabe et en anglais. En bas de page, « version … (nouveautés) » liste les nouveautés de chaque version en phrases simples.</w:t>
+        <w:t>Pour faire une remarque, le client clique sur un jour du pointage et l'écrit. Elle est signalée par un repère rouge dans la grille et envoyée par e-mail au responsable d’équipe.</w:t>
       </w:r>
     </w:p>
     <w:p>
@@ -3833,7 +3850,7 @@
               <a:graphicData uri="http://schemas.openxmlformats.org/drawingml/2006/picture">
                 <pic:pic>
                   <pic:nvPicPr>
-                    <pic:cNvPr id="0" name="97-aide.png"/>
+                    <pic:cNvPr id="0" name="81-client-remarque.png"/>
                     <pic:cNvPicPr/>
                   </pic:nvPicPr>
                   <pic:blipFill>
@@ -3866,7 +3883,7 @@
           <w:color w:val="6B7785"/>
           <w:sz w:val="18"/>
         </w:rPr>
-        <w:t>L'aide intégrée.</w:t>
+        <w:t>Le client laisse une remarque sur un jour.</w:t>
       </w:r>
     </w:p>
     <w:p>
@@ -3887,11 +3904,191 @@
               <a:graphicData uri="http://schemas.openxmlformats.org/drawingml/2006/picture">
                 <pic:pic>
                   <pic:nvPicPr>
+                    <pic:cNvPr id="0" name="83-remarque-prestataire.png"/>
+                    <pic:cNvPicPr/>
+                  </pic:nvPicPr>
+                  <pic:blipFill>
+                    <a:blip r:embed="rId41"/>
+                    <a:stretch>
+                      <a:fillRect/>
+                    </a:stretch>
+                  </pic:blipFill>
+                  <pic:spPr>
+                    <a:xfrm>
+                      <a:off x="0" y="0"/>
+                      <a:ext cx="5580000" cy="3364412"/>
+                    </a:xfrm>
+                    <a:prstGeom prst="rect"/>
+                  </pic:spPr>
+                </pic:pic>
+              </a:graphicData>
+            </a:graphic>
+          </wp:inline>
+        </w:drawing>
+      </w:r>
+    </w:p>
+    <w:p>
+      <w:pPr>
+        <w:jc w:val="center"/>
+      </w:pPr>
+      <w:r>
+        <w:rPr>
+          <w:i/>
+          <w:color w:val="6B7785"/>
+          <w:sz w:val="18"/>
+        </w:rPr>
+        <w:t>Le prestataire voit la remarque, la marque « vu » et peut répondre.</w:t>
+      </w:r>
+    </w:p>
+    <w:p>
+      <w:pPr>
+        <w:keepNext/>
+        <w:spacing w:after="40"/>
+        <w:jc w:val="center"/>
+      </w:pPr>
+      <w:r>
+        <w:drawing>
+          <wp:inline xmlns:a="http://schemas.openxmlformats.org/drawingml/2006/main" xmlns:pic="http://schemas.openxmlformats.org/drawingml/2006/picture">
+            <wp:extent cx="5580000" cy="3364412"/>
+            <wp:docPr id="33" name="Picture 33"/>
+            <wp:cNvGraphicFramePr>
+              <a:graphicFrameLocks noChangeAspect="1"/>
+            </wp:cNvGraphicFramePr>
+            <a:graphic>
+              <a:graphicData uri="http://schemas.openxmlformats.org/drawingml/2006/picture">
+                <pic:pic>
+                  <pic:nvPicPr>
+                    <pic:cNvPr id="0" name="82-client-contrat.png"/>
+                    <pic:cNvPicPr/>
+                  </pic:nvPicPr>
+                  <pic:blipFill>
+                    <a:blip r:embed="rId42"/>
+                    <a:stretch>
+                      <a:fillRect/>
+                    </a:stretch>
+                  </pic:blipFill>
+                  <pic:spPr>
+                    <a:xfrm>
+                      <a:off x="0" y="0"/>
+                      <a:ext cx="5580000" cy="3364412"/>
+                    </a:xfrm>
+                    <a:prstGeom prst="rect"/>
+                  </pic:spPr>
+                </pic:pic>
+              </a:graphicData>
+            </a:graphic>
+          </wp:inline>
+        </w:drawing>
+      </w:r>
+    </w:p>
+    <w:p>
+      <w:pPr>
+        <w:jc w:val="center"/>
+      </w:pPr>
+      <w:r>
+        <w:rPr>
+          <w:i/>
+          <w:color w:val="6B7785"/>
+          <w:sz w:val="18"/>
+        </w:rPr>
+        <w:t>Le contrat et les attachements, vus par le client.</w:t>
+      </w:r>
+    </w:p>
+    <w:p>
+      <w:r>
+        <w:br w:type="page"/>
+      </w:r>
+    </w:p>
+    <w:p>
+      <w:pPr>
+        <w:pStyle w:val="Heading1"/>
+      </w:pPr>
+      <w:r>
+        <w:t>7. Aide et nouveautés</w:t>
+      </w:r>
+    </w:p>
+    <w:p>
+      <w:r>
+        <w:t>L'onglet « Aide » explique chaque fonction, par profil, avec une barre de recherche, en français, en arabe et en anglais. En bas de page, « version … (nouveautés) » liste les nouveautés de chaque version en phrases simples.</w:t>
+      </w:r>
+    </w:p>
+    <w:p>
+      <w:pPr>
+        <w:keepNext/>
+        <w:spacing w:after="40"/>
+        <w:jc w:val="center"/>
+      </w:pPr>
+      <w:r>
+        <w:drawing>
+          <wp:inline xmlns:a="http://schemas.openxmlformats.org/drawingml/2006/main" xmlns:pic="http://schemas.openxmlformats.org/drawingml/2006/picture">
+            <wp:extent cx="5580000" cy="3364412"/>
+            <wp:docPr id="34" name="Picture 34"/>
+            <wp:cNvGraphicFramePr>
+              <a:graphicFrameLocks noChangeAspect="1"/>
+            </wp:cNvGraphicFramePr>
+            <a:graphic>
+              <a:graphicData uri="http://schemas.openxmlformats.org/drawingml/2006/picture">
+                <pic:pic>
+                  <pic:nvPicPr>
+                    <pic:cNvPr id="0" name="97-aide.png"/>
+                    <pic:cNvPicPr/>
+                  </pic:nvPicPr>
+                  <pic:blipFill>
+                    <a:blip r:embed="rId43"/>
+                    <a:stretch>
+                      <a:fillRect/>
+                    </a:stretch>
+                  </pic:blipFill>
+                  <pic:spPr>
+                    <a:xfrm>
+                      <a:off x="0" y="0"/>
+                      <a:ext cx="5580000" cy="3364412"/>
+                    </a:xfrm>
+                    <a:prstGeom prst="rect"/>
+                  </pic:spPr>
+                </pic:pic>
+              </a:graphicData>
+            </a:graphic>
+          </wp:inline>
+        </w:drawing>
+      </w:r>
+    </w:p>
+    <w:p>
+      <w:pPr>
+        <w:jc w:val="center"/>
+      </w:pPr>
+      <w:r>
+        <w:rPr>
+          <w:i/>
+          <w:color w:val="6B7785"/>
+          <w:sz w:val="18"/>
+        </w:rPr>
+        <w:t>L'aide intégrée.</w:t>
+      </w:r>
+    </w:p>
+    <w:p>
+      <w:pPr>
+        <w:keepNext/>
+        <w:spacing w:after="40"/>
+        <w:jc w:val="center"/>
+      </w:pPr>
+      <w:r>
+        <w:drawing>
+          <wp:inline xmlns:a="http://schemas.openxmlformats.org/drawingml/2006/main" xmlns:pic="http://schemas.openxmlformats.org/drawingml/2006/picture">
+            <wp:extent cx="5580000" cy="3364412"/>
+            <wp:docPr id="35" name="Picture 35"/>
+            <wp:cNvGraphicFramePr>
+              <a:graphicFrameLocks noChangeAspect="1"/>
+            </wp:cNvGraphicFramePr>
+            <a:graphic>
+              <a:graphicData uri="http://schemas.openxmlformats.org/drawingml/2006/picture">
+                <pic:pic>
+                  <pic:nvPicPr>
                     <pic:cNvPr id="0" name="90-nouveautes.png"/>
                     <pic:cNvPicPr/>
                   </pic:nvPicPr>
                   <pic:blipFill>
-                    <a:blip r:embed="rId41"/>
+                    <a:blip r:embed="rId44"/>
                     <a:stretch>
                       <a:fillRect/>
                     </a:stretch>

</xml_diff>

<commit_message>
v3.42.0 : accès des responsables d'équipe à l'attachement et à la facture réglable dans Setup (individuel / tous / aucun)
Co-Authored-By: Claude Sonnet 5.5 <noreply@anthropic.com>
Claude-Session: https://claude.ai/code/session_01X2N9yuBhmf2MHQAUEM1VoV
</commit_message>
<xml_diff>
--- a/Kit-Sijil/Sijil-Manuel.docx
+++ b/Kit-Sijil/Sijil-Manuel.docx
@@ -78,7 +78,7 @@
         <w:rPr>
           <w:color w:val="6B7785"/>
         </w:rPr>
-        <w:t>Version 3.41.0 · Octobre 2026</w:t>
+        <w:t>Version 3.42.0 · Octobre 2026</w:t>
       </w:r>
     </w:p>
     <w:p/>
@@ -3693,7 +3693,7 @@
     </w:p>
     <w:p>
       <w:r>
-        <w:t>Module Facturation : l'administrateur peut l'activer ou le désactiver dans Setup → Contrat (« Module Facturation »). Désactivé, Sijil s'arrête à l'attachement : la partie « 3. Facture » disparaît des exports et de l'historique des contrats, et l'édition de factures est refusée par le serveur. Les factures déjà établies sont conservées et réapparaissent si le module est réactivé.</w:t>
+        <w:t>Accès du responsable d'équipe : dans Setup → Contrat, l'administrateur choisit si les responsables d'équipe peuvent extraire l'attachement et la facture : selon chaque responsable (case de sa fiche Agent), tous, ou aucun. Module Facturation : l'administrateur peut l'activer ou le désactiver dans Setup → Contrat (« Module Facturation »). Désactivé, Sijil s'arrête à l'attachement : la partie « 3. Facture » disparaît des exports et de l'historique des contrats, et l'édition de factures est refusée par le serveur. Les factures déjà établies sont conservées et réapparaissent si le module est réactivé.</w:t>
       </w:r>
     </w:p>
     <w:p>

</xml_diff>